<commit_message>
add .ipynb file with instructions and code to execute this task
</commit_message>
<xml_diff>
--- a/Cronograma de execução - Plano de ação.docx
+++ b/Cronograma de execução - Plano de ação.docx
@@ -90,7 +90,6 @@
           <w:ilvl w:val="0"/>
           <w:numId w:val="1"/>
         </w:numPr>
-        <w:pBdr/>
         <w:tabs>
           <w:tab w:val="clear" w:pos="709"/>
           <w:tab w:val="left" w:pos="0" w:leader="none"/>
@@ -122,7 +121,6 @@
           <w:ilvl w:val="1"/>
           <w:numId w:val="1"/>
         </w:numPr>
-        <w:pBdr/>
         <w:tabs>
           <w:tab w:val="clear" w:pos="709"/>
           <w:tab w:val="left" w:pos="0" w:leader="none"/>
@@ -131,14 +129,15 @@
         <w:spacing w:lineRule="auto" w:line="274" w:before="0" w:after="140"/>
         <w:ind w:hanging="283" w:start="0" w:end="0"/>
         <w:rPr>
-          <w:rFonts w:ascii="Roboto" w:hAnsi="Roboto"/>
-          <w:sz w:val="22"/>
-          <w:szCs w:val="22"/>
-        </w:rPr>
-      </w:pPr>
-      <w:r>
-        <w:rPr>
-          <w:rFonts w:ascii="Roboto" w:hAnsi="Roboto"/>
+          <w:strike w:val="false"/>
+          <w:dstrike w:val="false"/>
+        </w:rPr>
+      </w:pPr>
+      <w:r>
+        <w:rPr>
+          <w:rFonts w:ascii="Roboto" w:hAnsi="Roboto"/>
+          <w:strike w:val="false"/>
+          <w:dstrike w:val="false"/>
           <w:sz w:val="22"/>
           <w:szCs w:val="22"/>
         </w:rPr>
@@ -148,6 +147,8 @@
         <w:rPr>
           <w:rFonts w:ascii="Roboto" w:hAnsi="Roboto"/>
           <w:i/>
+          <w:strike w:val="false"/>
+          <w:dstrike w:val="false"/>
           <w:sz w:val="22"/>
           <w:szCs w:val="22"/>
         </w:rPr>
@@ -156,6 +157,8 @@
       <w:r>
         <w:rPr>
           <w:rFonts w:ascii="Roboto" w:hAnsi="Roboto"/>
+          <w:strike w:val="false"/>
+          <w:dstrike w:val="false"/>
           <w:sz w:val="22"/>
           <w:szCs w:val="22"/>
         </w:rPr>
@@ -165,6 +168,8 @@
         <w:rPr>
           <w:rFonts w:ascii="Roboto" w:hAnsi="Roboto"/>
           <w:i/>
+          <w:strike w:val="false"/>
+          <w:dstrike w:val="false"/>
           <w:sz w:val="22"/>
           <w:szCs w:val="22"/>
         </w:rPr>
@@ -173,6 +178,8 @@
       <w:r>
         <w:rPr>
           <w:rFonts w:ascii="Roboto" w:hAnsi="Roboto"/>
+          <w:strike w:val="false"/>
+          <w:dstrike w:val="false"/>
           <w:sz w:val="22"/>
           <w:szCs w:val="22"/>
         </w:rPr>
@@ -186,7 +193,6 @@
           <w:ilvl w:val="1"/>
           <w:numId w:val="1"/>
         </w:numPr>
-        <w:pBdr/>
         <w:tabs>
           <w:tab w:val="clear" w:pos="709"/>
           <w:tab w:val="left" w:pos="0" w:leader="none"/>
@@ -195,14 +201,15 @@
         <w:spacing w:lineRule="auto" w:line="274" w:before="0" w:after="140"/>
         <w:ind w:hanging="283" w:start="0" w:end="0"/>
         <w:rPr>
-          <w:rFonts w:ascii="Roboto" w:hAnsi="Roboto"/>
-          <w:sz w:val="22"/>
-          <w:szCs w:val="22"/>
-        </w:rPr>
-      </w:pPr>
-      <w:r>
-        <w:rPr>
-          <w:rFonts w:ascii="Roboto" w:hAnsi="Roboto"/>
+          <w:strike w:val="false"/>
+          <w:dstrike w:val="false"/>
+        </w:rPr>
+      </w:pPr>
+      <w:r>
+        <w:rPr>
+          <w:rFonts w:ascii="Roboto" w:hAnsi="Roboto"/>
+          <w:strike w:val="false"/>
+          <w:dstrike w:val="false"/>
           <w:sz w:val="22"/>
           <w:szCs w:val="22"/>
         </w:rPr>
@@ -216,7 +223,6 @@
           <w:ilvl w:val="1"/>
           <w:numId w:val="1"/>
         </w:numPr>
-        <w:pBdr/>
         <w:tabs>
           <w:tab w:val="clear" w:pos="709"/>
           <w:tab w:val="left" w:pos="0" w:leader="none"/>
@@ -225,9 +231,8 @@
         <w:spacing w:lineRule="auto" w:line="274" w:before="0" w:after="140"/>
         <w:ind w:hanging="283" w:start="0" w:end="0"/>
         <w:rPr>
-          <w:rFonts w:ascii="Roboto" w:hAnsi="Roboto"/>
-          <w:sz w:val="22"/>
-          <w:szCs w:val="22"/>
+          <w:strike w:val="false"/>
+          <w:dstrike w:val="false"/>
         </w:rPr>
       </w:pPr>
       <w:bookmarkStart w:id="0" w:name="p-rc_c952a1f29501e5a4-110"/>
@@ -235,6 +240,8 @@
       <w:r>
         <w:rPr>
           <w:rFonts w:ascii="Roboto" w:hAnsi="Roboto"/>
+          <w:strike w:val="false"/>
+          <w:dstrike w:val="false"/>
           <w:sz w:val="22"/>
           <w:szCs w:val="22"/>
         </w:rPr>
@@ -248,7 +255,6 @@
           <w:ilvl w:val="1"/>
           <w:numId w:val="1"/>
         </w:numPr>
-        <w:pBdr/>
         <w:tabs>
           <w:tab w:val="clear" w:pos="709"/>
           <w:tab w:val="left" w:pos="0" w:leader="none"/>
@@ -256,15 +262,15 @@
         <w:bidi w:val="0"/>
         <w:spacing w:lineRule="auto" w:line="274" w:before="0" w:after="140"/>
         <w:ind w:hanging="283" w:start="0" w:end="0"/>
-        <w:rPr>
-          <w:rFonts w:ascii="Roboto" w:hAnsi="Roboto"/>
-        </w:rPr>
+        <w:rPr/>
       </w:pPr>
       <w:bookmarkStart w:id="1" w:name="p-rc_c952a1f29501e5a4-111"/>
       <w:bookmarkEnd w:id="1"/>
       <w:r>
         <w:rPr>
           <w:rFonts w:ascii="Roboto" w:hAnsi="Roboto"/>
+          <w:strike w:val="false"/>
+          <w:dstrike w:val="false"/>
           <w:sz w:val="22"/>
           <w:szCs w:val="22"/>
         </w:rPr>
@@ -274,6 +280,8 @@
         <w:rPr>
           <w:rFonts w:ascii="Roboto" w:hAnsi="Roboto"/>
           <w:b/>
+          <w:strike w:val="false"/>
+          <w:dstrike w:val="false"/>
           <w:sz w:val="22"/>
           <w:szCs w:val="22"/>
         </w:rPr>
@@ -282,6 +290,8 @@
       <w:r>
         <w:rPr>
           <w:rFonts w:ascii="Roboto" w:hAnsi="Roboto"/>
+          <w:strike w:val="false"/>
+          <w:dstrike w:val="false"/>
           <w:sz w:val="22"/>
           <w:szCs w:val="22"/>
         </w:rPr>
@@ -291,6 +301,8 @@
         <w:rPr>
           <w:rFonts w:ascii="Roboto" w:hAnsi="Roboto"/>
           <w:b/>
+          <w:strike w:val="false"/>
+          <w:dstrike w:val="false"/>
           <w:sz w:val="22"/>
           <w:szCs w:val="22"/>
         </w:rPr>
@@ -299,6 +311,8 @@
       <w:r>
         <w:rPr>
           <w:rFonts w:ascii="Roboto" w:hAnsi="Roboto"/>
+          <w:strike w:val="false"/>
+          <w:dstrike w:val="false"/>
           <w:sz w:val="22"/>
           <w:szCs w:val="22"/>
         </w:rPr>
@@ -308,6 +322,8 @@
         <w:rPr>
           <w:rFonts w:ascii="Roboto" w:hAnsi="Roboto"/>
           <w:b/>
+          <w:strike w:val="false"/>
+          <w:dstrike w:val="false"/>
           <w:sz w:val="22"/>
           <w:szCs w:val="22"/>
         </w:rPr>
@@ -316,6 +332,8 @@
       <w:r>
         <w:rPr>
           <w:rFonts w:ascii="Roboto" w:hAnsi="Roboto"/>
+          <w:strike w:val="false"/>
+          <w:dstrike w:val="false"/>
           <w:sz w:val="22"/>
           <w:szCs w:val="22"/>
         </w:rPr>
@@ -323,8 +341,10 @@
       </w:r>
       <w:r>
         <w:rPr>
-          <w:rStyle w:val="Cdigo-fonte"/>
-          <w:rFonts w:ascii="Roboto" w:hAnsi="Roboto"/>
+          <w:rStyle w:val="Cdigo-fonteuser"/>
+          <w:rFonts w:ascii="Roboto" w:hAnsi="Roboto"/>
+          <w:strike w:val="false"/>
+          <w:dstrike w:val="false"/>
           <w:sz w:val="22"/>
           <w:szCs w:val="22"/>
         </w:rPr>
@@ -333,6 +353,8 @@
       <w:r>
         <w:rPr>
           <w:rFonts w:ascii="Roboto" w:hAnsi="Roboto"/>
+          <w:strike w:val="false"/>
+          <w:dstrike w:val="false"/>
           <w:sz w:val="22"/>
           <w:szCs w:val="22"/>
         </w:rPr>
@@ -346,7 +368,6 @@
           <w:ilvl w:val="0"/>
           <w:numId w:val="1"/>
         </w:numPr>
-        <w:pBdr/>
         <w:tabs>
           <w:tab w:val="clear" w:pos="709"/>
           <w:tab w:val="left" w:pos="0" w:leader="none"/>
@@ -369,7 +390,7 @@
       </w:r>
       <w:r>
         <w:rPr>
-          <w:rStyle w:val="Cdigo-fonte"/>
+          <w:rStyle w:val="Cdigo-fonteuser"/>
           <w:rFonts w:ascii="Roboto" w:hAnsi="Roboto"/>
           <w:b/>
           <w:sz w:val="22"/>
@@ -394,7 +415,6 @@
           <w:ilvl w:val="1"/>
           <w:numId w:val="2"/>
         </w:numPr>
-        <w:pBdr/>
         <w:tabs>
           <w:tab w:val="clear" w:pos="709"/>
           <w:tab w:val="left" w:pos="0" w:leader="none"/>
@@ -487,7 +507,6 @@
           <w:ilvl w:val="0"/>
           <w:numId w:val="3"/>
         </w:numPr>
-        <w:pBdr/>
         <w:tabs>
           <w:tab w:val="clear" w:pos="709"/>
           <w:tab w:val="left" w:pos="0" w:leader="none"/>
@@ -519,7 +538,6 @@
           <w:ilvl w:val="1"/>
           <w:numId w:val="3"/>
         </w:numPr>
-        <w:pBdr/>
         <w:tabs>
           <w:tab w:val="clear" w:pos="709"/>
           <w:tab w:val="left" w:pos="0" w:leader="none"/>
@@ -543,7 +561,7 @@
       </w:r>
       <w:r>
         <w:rPr>
-          <w:rStyle w:val="Cdigo-fonte"/>
+          <w:rStyle w:val="Cdigo-fonteuser"/>
           <w:rFonts w:ascii="Roboto" w:hAnsi="Roboto"/>
           <w:sz w:val="22"/>
           <w:szCs w:val="22"/>
@@ -566,7 +584,6 @@
           <w:ilvl w:val="1"/>
           <w:numId w:val="3"/>
         </w:numPr>
-        <w:pBdr/>
         <w:tabs>
           <w:tab w:val="clear" w:pos="709"/>
           <w:tab w:val="left" w:pos="0" w:leader="none"/>
@@ -615,7 +632,6 @@
           <w:ilvl w:val="1"/>
           <w:numId w:val="3"/>
         </w:numPr>
-        <w:pBdr/>
         <w:tabs>
           <w:tab w:val="clear" w:pos="709"/>
           <w:tab w:val="left" w:pos="0" w:leader="none"/>
@@ -645,7 +661,6 @@
           <w:ilvl w:val="2"/>
           <w:numId w:val="3"/>
         </w:numPr>
-        <w:pBdr/>
         <w:tabs>
           <w:tab w:val="clear" w:pos="709"/>
           <w:tab w:val="left" w:pos="0" w:leader="none"/>
@@ -682,22 +697,18 @@
     <w:p>
       <w:pPr>
         <w:pStyle w:val="BodyText"/>
-        <w:pBdr/>
         <w:bidi w:val="0"/>
         <w:spacing w:lineRule="auto" w:line="274" w:before="0" w:after="140"/>
         <w:ind w:hanging="0" w:start="0" w:end="0"/>
-        <w:rPr>
-          <w:rFonts w:ascii="Roboto" w:hAnsi="Roboto"/>
-          <w:sz w:val="22"/>
-          <w:szCs w:val="22"/>
-        </w:rPr>
-      </w:pPr>
-      <w:r>
-        <w:rPr>
-          <w:rFonts w:ascii="Roboto" w:hAnsi="Roboto"/>
-          <w:sz w:val="22"/>
-          <w:szCs w:val="22"/>
-        </w:rPr>
+        <w:jc w:val="start"/>
+        <w:rPr>
+          <w:rFonts w:ascii="Roboto" w:hAnsi="Roboto"/>
+          <w:sz w:val="22"/>
+          <w:szCs w:val="22"/>
+        </w:rPr>
+      </w:pPr>
+      <w:r>
+        <w:rPr/>
       </w:r>
       <m:oMathPara xmlns:m="http://schemas.openxmlformats.org/officeDocument/2006/math">
         <m:oMathParaPr>
@@ -752,6 +763,10 @@
             </m:den>
           </m:f>
           <m:r>
+            <m:rPr>
+              <m:lit/>
+              <m:nor/>
+            </m:rPr>
             <m:t xml:space="preserve"> </m:t>
           </m:r>
           <m:r>
@@ -762,6 +777,10 @@
             <m:t xml:space="preserve">e</m:t>
           </m:r>
           <m:r>
+            <m:rPr>
+              <m:lit/>
+              <m:nor/>
+            </m:rPr>
             <m:t xml:space="preserve"> </m:t>
           </m:r>
           <m:r>
@@ -832,7 +851,6 @@
     <w:p>
       <w:pPr>
         <w:pStyle w:val="BodyText"/>
-        <w:pBdr/>
         <w:bidi w:val="0"/>
         <w:spacing w:lineRule="auto" w:line="274" w:before="0" w:after="140"/>
         <w:ind w:hanging="0" w:start="0" w:end="0"/>
@@ -857,7 +875,6 @@
           <w:ilvl w:val="2"/>
           <w:numId w:val="3"/>
         </w:numPr>
-        <w:pBdr/>
         <w:tabs>
           <w:tab w:val="clear" w:pos="709"/>
           <w:tab w:val="left" w:pos="0" w:leader="none"/>
@@ -894,22 +911,18 @@
     <w:p>
       <w:pPr>
         <w:pStyle w:val="BodyText"/>
-        <w:pBdr/>
         <w:bidi w:val="0"/>
         <w:spacing w:lineRule="auto" w:line="274" w:before="0" w:after="140"/>
         <w:ind w:hanging="0" w:start="0" w:end="0"/>
-        <w:rPr>
-          <w:rFonts w:ascii="Roboto" w:hAnsi="Roboto"/>
-          <w:sz w:val="22"/>
-          <w:szCs w:val="22"/>
-        </w:rPr>
-      </w:pPr>
-      <w:r>
-        <w:rPr>
-          <w:rFonts w:ascii="Roboto" w:hAnsi="Roboto"/>
-          <w:sz w:val="22"/>
-          <w:szCs w:val="22"/>
-        </w:rPr>
+        <w:jc w:val="start"/>
+        <w:rPr>
+          <w:rFonts w:ascii="Roboto" w:hAnsi="Roboto"/>
+          <w:sz w:val="22"/>
+          <w:szCs w:val="22"/>
+        </w:rPr>
+      </w:pPr>
+      <w:r>
+        <w:rPr/>
       </w:r>
       <m:oMathPara xmlns:m="http://schemas.openxmlformats.org/officeDocument/2006/math">
         <m:oMathParaPr>
@@ -958,6 +971,10 @@
             </m:e>
           </m:d>
           <m:r>
+            <m:rPr>
+              <m:lit/>
+              <m:nor/>
+            </m:rPr>
             <m:t xml:space="preserve"> </m:t>
           </m:r>
           <m:r>
@@ -968,6 +985,10 @@
             <m:t xml:space="preserve">e</m:t>
           </m:r>
           <m:r>
+            <m:rPr>
+              <m:lit/>
+              <m:nor/>
+            </m:rPr>
             <m:t xml:space="preserve"> </m:t>
           </m:r>
           <m:r>
@@ -1056,7 +1077,6 @@
     <w:p>
       <w:pPr>
         <w:pStyle w:val="BodyText"/>
-        <w:pBdr/>
         <w:bidi w:val="0"/>
         <w:spacing w:lineRule="auto" w:line="274" w:before="0" w:after="140"/>
         <w:ind w:hanging="0" w:start="0" w:end="0"/>
@@ -1081,7 +1101,6 @@
           <w:ilvl w:val="2"/>
           <w:numId w:val="3"/>
         </w:numPr>
-        <w:pBdr/>
         <w:tabs>
           <w:tab w:val="clear" w:pos="709"/>
           <w:tab w:val="left" w:pos="0" w:leader="none"/>
@@ -1118,22 +1137,18 @@
     <w:p>
       <w:pPr>
         <w:pStyle w:val="BodyText"/>
-        <w:pBdr/>
         <w:bidi w:val="0"/>
         <w:spacing w:lineRule="auto" w:line="274" w:before="0" w:after="140"/>
         <w:ind w:hanging="0" w:start="0" w:end="0"/>
-        <w:rPr>
-          <w:rFonts w:ascii="Roboto" w:hAnsi="Roboto"/>
-          <w:sz w:val="22"/>
-          <w:szCs w:val="22"/>
-        </w:rPr>
-      </w:pPr>
-      <w:r>
-        <w:rPr>
-          <w:rFonts w:ascii="Roboto" w:hAnsi="Roboto"/>
-          <w:sz w:val="22"/>
-          <w:szCs w:val="22"/>
-        </w:rPr>
+        <w:jc w:val="start"/>
+        <w:rPr>
+          <w:rFonts w:ascii="Roboto" w:hAnsi="Roboto"/>
+          <w:sz w:val="22"/>
+          <w:szCs w:val="22"/>
+        </w:rPr>
+      </w:pPr>
+      <w:r>
+        <w:rPr/>
       </w:r>
       <m:oMathPara xmlns:m="http://schemas.openxmlformats.org/officeDocument/2006/math">
         <m:oMathParaPr>
@@ -1224,6 +1239,10 @@
             </m:den>
           </m:f>
           <m:r>
+            <m:rPr>
+              <m:lit/>
+              <m:nor/>
+            </m:rPr>
             <m:t xml:space="preserve"> </m:t>
           </m:r>
           <m:r>
@@ -1234,6 +1253,10 @@
             <m:t xml:space="preserve">e</m:t>
           </m:r>
           <m:r>
+            <m:rPr>
+              <m:lit/>
+              <m:nor/>
+            </m:rPr>
             <m:t xml:space="preserve"> </m:t>
           </m:r>
           <m:r>
@@ -1295,7 +1318,6 @@
           <w:ilvl w:val="1"/>
           <w:numId w:val="3"/>
         </w:numPr>
-        <w:pBdr/>
         <w:tabs>
           <w:tab w:val="clear" w:pos="709"/>
           <w:tab w:val="left" w:pos="0" w:leader="none"/>
@@ -1344,7 +1366,6 @@
           <w:ilvl w:val="0"/>
           <w:numId w:val="3"/>
         </w:numPr>
-        <w:pBdr/>
         <w:tabs>
           <w:tab w:val="clear" w:pos="709"/>
           <w:tab w:val="left" w:pos="0" w:leader="none"/>
@@ -1367,7 +1388,7 @@
       </w:r>
       <w:r>
         <w:rPr>
-          <w:rStyle w:val="Cdigo-fonte"/>
+          <w:rStyle w:val="Cdigo-fonteuser"/>
           <w:rFonts w:ascii="Roboto" w:hAnsi="Roboto"/>
           <w:b/>
           <w:sz w:val="22"/>
@@ -1392,7 +1413,6 @@
           <w:ilvl w:val="1"/>
           <w:numId w:val="4"/>
         </w:numPr>
-        <w:pBdr/>
         <w:tabs>
           <w:tab w:val="clear" w:pos="709"/>
           <w:tab w:val="left" w:pos="0" w:leader="none"/>
@@ -1418,7 +1438,6 @@
     <w:p>
       <w:pPr>
         <w:pStyle w:val="BodyText"/>
-        <w:pBdr/>
         <w:bidi w:val="0"/>
         <w:spacing w:lineRule="auto" w:line="274" w:before="0" w:after="140"/>
         <w:ind w:hanging="0" w:start="0" w:end="0"/>
@@ -1465,7 +1484,6 @@
           <w:ilvl w:val="0"/>
           <w:numId w:val="5"/>
         </w:numPr>
-        <w:pBdr/>
         <w:tabs>
           <w:tab w:val="clear" w:pos="709"/>
           <w:tab w:val="left" w:pos="0" w:leader="none"/>
@@ -1497,7 +1515,6 @@
           <w:ilvl w:val="1"/>
           <w:numId w:val="5"/>
         </w:numPr>
-        <w:pBdr/>
         <w:tabs>
           <w:tab w:val="clear" w:pos="709"/>
           <w:tab w:val="left" w:pos="0" w:leader="none"/>
@@ -1546,7 +1563,6 @@
           <w:ilvl w:val="1"/>
           <w:numId w:val="5"/>
         </w:numPr>
-        <w:pBdr/>
         <w:tabs>
           <w:tab w:val="clear" w:pos="709"/>
           <w:tab w:val="left" w:pos="0" w:leader="none"/>
@@ -1612,7 +1628,6 @@
           <w:ilvl w:val="1"/>
           <w:numId w:val="5"/>
         </w:numPr>
-        <w:pBdr/>
         <w:tabs>
           <w:tab w:val="clear" w:pos="709"/>
           <w:tab w:val="left" w:pos="0" w:leader="none"/>
@@ -1659,7 +1674,6 @@
           <w:ilvl w:val="1"/>
           <w:numId w:val="5"/>
         </w:numPr>
-        <w:pBdr/>
         <w:tabs>
           <w:tab w:val="clear" w:pos="709"/>
           <w:tab w:val="left" w:pos="0" w:leader="none"/>
@@ -1691,7 +1705,6 @@
           <w:ilvl w:val="2"/>
           <w:numId w:val="5"/>
         </w:numPr>
-        <w:pBdr/>
         <w:tabs>
           <w:tab w:val="clear" w:pos="709"/>
           <w:tab w:val="left" w:pos="0" w:leader="none"/>
@@ -1723,7 +1736,6 @@
           <w:ilvl w:val="2"/>
           <w:numId w:val="5"/>
         </w:numPr>
-        <w:pBdr/>
         <w:tabs>
           <w:tab w:val="clear" w:pos="709"/>
           <w:tab w:val="left" w:pos="0" w:leader="none"/>
@@ -1755,7 +1767,6 @@
           <w:ilvl w:val="2"/>
           <w:numId w:val="5"/>
         </w:numPr>
-        <w:pBdr/>
         <w:tabs>
           <w:tab w:val="clear" w:pos="709"/>
           <w:tab w:val="left" w:pos="0" w:leader="none"/>
@@ -1787,7 +1798,6 @@
           <w:ilvl w:val="2"/>
           <w:numId w:val="5"/>
         </w:numPr>
-        <w:pBdr/>
         <w:tabs>
           <w:tab w:val="clear" w:pos="709"/>
           <w:tab w:val="left" w:pos="0" w:leader="none"/>
@@ -1819,7 +1829,6 @@
           <w:ilvl w:val="0"/>
           <w:numId w:val="5"/>
         </w:numPr>
-        <w:pBdr/>
         <w:tabs>
           <w:tab w:val="clear" w:pos="709"/>
           <w:tab w:val="left" w:pos="0" w:leader="none"/>
@@ -1842,7 +1851,7 @@
       </w:r>
       <w:r>
         <w:rPr>
-          <w:rStyle w:val="Cdigo-fonte"/>
+          <w:rStyle w:val="Cdigo-fonteuser"/>
           <w:rFonts w:ascii="Roboto" w:hAnsi="Roboto"/>
           <w:b/>
           <w:sz w:val="22"/>
@@ -1867,7 +1876,6 @@
           <w:ilvl w:val="1"/>
           <w:numId w:val="6"/>
         </w:numPr>
-        <w:pBdr/>
         <w:tabs>
           <w:tab w:val="clear" w:pos="709"/>
           <w:tab w:val="left" w:pos="0" w:leader="none"/>
@@ -1936,7 +1944,6 @@
     <w:p>
       <w:pPr>
         <w:pStyle w:val="BodyText"/>
-        <w:pBdr/>
         <w:bidi w:val="0"/>
         <w:spacing w:lineRule="auto" w:line="274" w:before="0" w:after="140"/>
         <w:ind w:hanging="0" w:start="0" w:end="0"/>
@@ -1964,7 +1971,6 @@
           <w:ilvl w:val="1"/>
           <w:numId w:val="7"/>
         </w:numPr>
-        <w:pBdr/>
         <w:tabs>
           <w:tab w:val="clear" w:pos="709"/>
           <w:tab w:val="left" w:pos="0" w:leader="none"/>
@@ -1994,7 +2000,6 @@
           <w:ilvl w:val="2"/>
           <w:numId w:val="7"/>
         </w:numPr>
-        <w:pBdr/>
         <w:tabs>
           <w:tab w:val="clear" w:pos="709"/>
           <w:tab w:val="left" w:pos="0" w:leader="none"/>
@@ -2033,7 +2038,6 @@
           <w:ilvl w:val="2"/>
           <w:numId w:val="7"/>
         </w:numPr>
-        <w:pBdr/>
         <w:tabs>
           <w:tab w:val="clear" w:pos="709"/>
           <w:tab w:val="left" w:pos="0" w:leader="none"/>
@@ -2072,7 +2076,6 @@
           <w:ilvl w:val="2"/>
           <w:numId w:val="7"/>
         </w:numPr>
-        <w:pBdr/>
         <w:tabs>
           <w:tab w:val="clear" w:pos="709"/>
           <w:tab w:val="left" w:pos="0" w:leader="none"/>
@@ -2080,18 +2083,15 @@
         <w:bidi w:val="0"/>
         <w:spacing w:lineRule="auto" w:line="274" w:before="0" w:after="140"/>
         <w:ind w:hanging="283" w:start="0" w:end="0"/>
-        <w:rPr>
-          <w:rFonts w:ascii="Roboto" w:hAnsi="Roboto"/>
-          <w:sz w:val="22"/>
-          <w:szCs w:val="22"/>
-        </w:rPr>
-      </w:pPr>
-      <w:r>
-        <w:rPr>
-          <w:rFonts w:ascii="Roboto" w:hAnsi="Roboto"/>
-          <w:sz w:val="22"/>
-          <w:szCs w:val="22"/>
-        </w:rPr>
+        <w:jc w:val="start"/>
+        <w:rPr>
+          <w:rFonts w:ascii="Roboto" w:hAnsi="Roboto"/>
+          <w:sz w:val="22"/>
+          <w:szCs w:val="22"/>
+        </w:rPr>
+      </w:pPr>
+      <w:r>
+        <w:rPr/>
       </w:r>
       <m:oMathPara xmlns:m="http://schemas.openxmlformats.org/officeDocument/2006/math">
         <m:oMathParaPr>
@@ -2124,6 +2124,10 @@
                 <m:t xml:space="preserve">;</m:t>
               </m:r>
               <m:r>
+                <m:rPr>
+                  <m:lit/>
+                  <m:nor/>
+                </m:rPr>
                 <m:t xml:space="preserve"> </m:t>
               </m:r>
               <m:r>
@@ -2133,6 +2137,10 @@
                 <m:t xml:space="preserve">;</m:t>
               </m:r>
               <m:r>
+                <m:rPr>
+                  <m:lit/>
+                  <m:nor/>
+                </m:rPr>
                 <m:t xml:space="preserve"> </m:t>
               </m:r>
               <m:r>
@@ -2142,6 +2150,10 @@
                 <m:t xml:space="preserve">;</m:t>
               </m:r>
               <m:r>
+                <m:rPr>
+                  <m:lit/>
+                  <m:nor/>
+                </m:rPr>
                 <m:t xml:space="preserve"> </m:t>
               </m:r>
               <m:r>
@@ -2150,6 +2162,10 @@
             </m:e>
           </m:d>
           <m:r>
+            <m:rPr>
+              <m:lit/>
+              <m:nor/>
+            </m:rPr>
             <m:t xml:space="preserve"> </m:t>
           </m:r>
           <m:r>
@@ -2160,6 +2176,10 @@
             <m:t xml:space="preserve">e</m:t>
           </m:r>
           <m:r>
+            <m:rPr>
+              <m:lit/>
+              <m:nor/>
+            </m:rPr>
             <m:t xml:space="preserve"> </m:t>
           </m:r>
           <m:r>
@@ -2181,6 +2201,10 @@
                 <m:t xml:space="preserve">;</m:t>
               </m:r>
               <m:r>
+                <m:rPr>
+                  <m:lit/>
+                  <m:nor/>
+                </m:rPr>
                 <m:t xml:space="preserve"> </m:t>
               </m:r>
               <m:r>
@@ -2190,6 +2214,10 @@
                 <m:t xml:space="preserve">;</m:t>
               </m:r>
               <m:r>
+                <m:rPr>
+                  <m:lit/>
+                  <m:nor/>
+                </m:rPr>
                 <m:t xml:space="preserve"> </m:t>
               </m:r>
               <m:r>
@@ -2207,7 +2235,6 @@
           <w:ilvl w:val="2"/>
           <w:numId w:val="7"/>
         </w:numPr>
-        <w:pBdr/>
         <w:tabs>
           <w:tab w:val="clear" w:pos="709"/>
           <w:tab w:val="left" w:pos="0" w:leader="none"/>
@@ -2246,7 +2273,6 @@
           <w:ilvl w:val="1"/>
           <w:numId w:val="7"/>
         </w:numPr>
-        <w:pBdr/>
         <w:tabs>
           <w:tab w:val="clear" w:pos="709"/>
           <w:tab w:val="left" w:pos="0" w:leader="none"/>
@@ -2276,7 +2302,6 @@
           <w:ilvl w:val="0"/>
           <w:numId w:val="7"/>
         </w:numPr>
-        <w:pBdr/>
         <w:tabs>
           <w:tab w:val="clear" w:pos="709"/>
           <w:tab w:val="left" w:pos="0" w:leader="none"/>
@@ -2299,7 +2324,7 @@
       </w:r>
       <w:r>
         <w:rPr>
-          <w:rStyle w:val="Cdigo-fonte"/>
+          <w:rStyle w:val="Cdigo-fonteuser"/>
           <w:rFonts w:ascii="Roboto" w:hAnsi="Roboto"/>
           <w:b/>
           <w:sz w:val="22"/>
@@ -2324,7 +2349,6 @@
           <w:ilvl w:val="1"/>
           <w:numId w:val="8"/>
         </w:numPr>
-        <w:pBdr/>
         <w:tabs>
           <w:tab w:val="clear" w:pos="709"/>
           <w:tab w:val="left" w:pos="0" w:leader="none"/>
@@ -2354,7 +2378,6 @@
           <w:ilvl w:val="0"/>
           <w:numId w:val="0"/>
         </w:numPr>
-        <w:pBdr/>
         <w:bidi w:val="0"/>
         <w:spacing w:lineRule="auto" w:line="274" w:before="0" w:after="140"/>
         <w:ind w:hanging="0" w:start="0" w:end="0"/>
@@ -2375,7 +2398,6 @@
     <w:p>
       <w:pPr>
         <w:pStyle w:val="BodyText"/>
-        <w:pBdr/>
         <w:bidi w:val="0"/>
         <w:spacing w:lineRule="auto" w:line="274" w:before="0" w:after="140"/>
         <w:ind w:hanging="0" w:start="0" w:end="0"/>
@@ -2402,7 +2424,6 @@
     <w:p>
       <w:pPr>
         <w:pStyle w:val="BodyText"/>
-        <w:pBdr/>
         <w:bidi w:val="0"/>
         <w:spacing w:lineRule="auto" w:line="274" w:before="0" w:after="140"/>
         <w:ind w:hanging="0" w:start="0" w:end="0"/>
@@ -2430,7 +2451,6 @@
           <w:ilvl w:val="1"/>
           <w:numId w:val="9"/>
         </w:numPr>
-        <w:pBdr/>
         <w:tabs>
           <w:tab w:val="clear" w:pos="709"/>
           <w:tab w:val="left" w:pos="0" w:leader="none"/>
@@ -2460,7 +2480,6 @@
           <w:ilvl w:val="1"/>
           <w:numId w:val="9"/>
         </w:numPr>
-        <w:pBdr/>
         <w:tabs>
           <w:tab w:val="clear" w:pos="709"/>
           <w:tab w:val="left" w:pos="0" w:leader="none"/>
@@ -2507,7 +2526,6 @@
           <w:ilvl w:val="1"/>
           <w:numId w:val="9"/>
         </w:numPr>
-        <w:pBdr/>
         <w:tabs>
           <w:tab w:val="clear" w:pos="709"/>
           <w:tab w:val="left" w:pos="0" w:leader="none"/>
@@ -2533,7 +2551,6 @@
     <w:p>
       <w:pPr>
         <w:pStyle w:val="BodyText"/>
-        <w:pBdr/>
         <w:bidi w:val="0"/>
         <w:spacing w:lineRule="auto" w:line="274" w:before="0" w:after="140"/>
         <w:ind w:hanging="0" w:start="0" w:end="0"/>
@@ -2556,7 +2573,6 @@
     <w:p>
       <w:pPr>
         <w:pStyle w:val="BodyText"/>
-        <w:pBdr/>
         <w:bidi w:val="0"/>
         <w:spacing w:lineRule="auto" w:line="274" w:before="0" w:after="140"/>
         <w:ind w:hanging="0" w:start="0" w:end="0"/>
@@ -2575,7 +2591,7 @@
       </w:r>
       <w:r>
         <w:rPr>
-          <w:rStyle w:val="Cdigo-fonte"/>
+          <w:rStyle w:val="Cdigo-fonteuser"/>
           <w:rFonts w:ascii="Roboto" w:hAnsi="Roboto"/>
           <w:b/>
           <w:sz w:val="22"/>
@@ -2600,7 +2616,6 @@
           <w:ilvl w:val="1"/>
           <w:numId w:val="10"/>
         </w:numPr>
-        <w:pBdr/>
         <w:tabs>
           <w:tab w:val="clear" w:pos="709"/>
           <w:tab w:val="left" w:pos="0" w:leader="none"/>
@@ -2648,6 +2663,7 @@
       <w:pgNumType w:fmt="decimal"/>
       <w:formProt w:val="false"/>
       <w:textDirection w:val="lrTb"/>
+      <w:docGrid w:type="default" w:linePitch="100" w:charSpace="0"/>
     </w:sectPr>
   </w:body>
 </w:document>
@@ -2818,6 +2834,7 @@
         </w:tabs>
         <w:ind w:start="1440" w:hanging="360"/>
       </w:pPr>
+      <w:rPr/>
     </w:lvl>
     <w:lvl w:ilvl="3">
       <w:start w:val="1"/>
@@ -2830,6 +2847,7 @@
         </w:tabs>
         <w:ind w:start="1800" w:hanging="360"/>
       </w:pPr>
+      <w:rPr/>
     </w:lvl>
     <w:lvl w:ilvl="4">
       <w:start w:val="1"/>
@@ -2842,6 +2860,7 @@
         </w:tabs>
         <w:ind w:start="2160" w:hanging="360"/>
       </w:pPr>
+      <w:rPr/>
     </w:lvl>
     <w:lvl w:ilvl="5">
       <w:start w:val="1"/>
@@ -2854,6 +2873,7 @@
         </w:tabs>
         <w:ind w:start="2520" w:hanging="360"/>
       </w:pPr>
+      <w:rPr/>
     </w:lvl>
     <w:lvl w:ilvl="6">
       <w:start w:val="1"/>
@@ -2866,6 +2886,7 @@
         </w:tabs>
         <w:ind w:start="2880" w:hanging="360"/>
       </w:pPr>
+      <w:rPr/>
     </w:lvl>
     <w:lvl w:ilvl="7">
       <w:start w:val="1"/>
@@ -2878,6 +2899,7 @@
         </w:tabs>
         <w:ind w:start="3240" w:hanging="360"/>
       </w:pPr>
+      <w:rPr/>
     </w:lvl>
     <w:lvl w:ilvl="8">
       <w:start w:val="1"/>
@@ -2890,6 +2912,7 @@
         </w:tabs>
         <w:ind w:start="3600" w:hanging="360"/>
       </w:pPr>
+      <w:rPr/>
     </w:lvl>
   </w:abstractNum>
   <w:abstractNum w:abstractNumId="3">
@@ -3069,6 +3092,7 @@
         </w:tabs>
         <w:ind w:start="1440" w:hanging="360"/>
       </w:pPr>
+      <w:rPr/>
     </w:lvl>
     <w:lvl w:ilvl="3">
       <w:start w:val="1"/>
@@ -3081,6 +3105,7 @@
         </w:tabs>
         <w:ind w:start="1800" w:hanging="360"/>
       </w:pPr>
+      <w:rPr/>
     </w:lvl>
     <w:lvl w:ilvl="4">
       <w:start w:val="1"/>
@@ -3093,6 +3118,7 @@
         </w:tabs>
         <w:ind w:start="2160" w:hanging="360"/>
       </w:pPr>
+      <w:rPr/>
     </w:lvl>
     <w:lvl w:ilvl="5">
       <w:start w:val="1"/>
@@ -3105,6 +3131,7 @@
         </w:tabs>
         <w:ind w:start="2520" w:hanging="360"/>
       </w:pPr>
+      <w:rPr/>
     </w:lvl>
     <w:lvl w:ilvl="6">
       <w:start w:val="1"/>
@@ -3117,6 +3144,7 @@
         </w:tabs>
         <w:ind w:start="2880" w:hanging="360"/>
       </w:pPr>
+      <w:rPr/>
     </w:lvl>
     <w:lvl w:ilvl="7">
       <w:start w:val="1"/>
@@ -3129,6 +3157,7 @@
         </w:tabs>
         <w:ind w:start="3240" w:hanging="360"/>
       </w:pPr>
+      <w:rPr/>
     </w:lvl>
     <w:lvl w:ilvl="8">
       <w:start w:val="1"/>
@@ -3141,6 +3170,7 @@
         </w:tabs>
         <w:ind w:start="3600" w:hanging="360"/>
       </w:pPr>
+      <w:rPr/>
     </w:lvl>
   </w:abstractNum>
   <w:abstractNum w:abstractNumId="5">
@@ -3320,6 +3350,7 @@
         </w:tabs>
         <w:ind w:start="1440" w:hanging="360"/>
       </w:pPr>
+      <w:rPr/>
     </w:lvl>
     <w:lvl w:ilvl="3">
       <w:start w:val="1"/>
@@ -3332,6 +3363,7 @@
         </w:tabs>
         <w:ind w:start="1800" w:hanging="360"/>
       </w:pPr>
+      <w:rPr/>
     </w:lvl>
     <w:lvl w:ilvl="4">
       <w:start w:val="1"/>
@@ -3344,6 +3376,7 @@
         </w:tabs>
         <w:ind w:start="2160" w:hanging="360"/>
       </w:pPr>
+      <w:rPr/>
     </w:lvl>
     <w:lvl w:ilvl="5">
       <w:start w:val="1"/>
@@ -3356,6 +3389,7 @@
         </w:tabs>
         <w:ind w:start="2520" w:hanging="360"/>
       </w:pPr>
+      <w:rPr/>
     </w:lvl>
     <w:lvl w:ilvl="6">
       <w:start w:val="1"/>
@@ -3368,6 +3402,7 @@
         </w:tabs>
         <w:ind w:start="2880" w:hanging="360"/>
       </w:pPr>
+      <w:rPr/>
     </w:lvl>
     <w:lvl w:ilvl="7">
       <w:start w:val="1"/>
@@ -3380,6 +3415,7 @@
         </w:tabs>
         <w:ind w:start="3240" w:hanging="360"/>
       </w:pPr>
+      <w:rPr/>
     </w:lvl>
     <w:lvl w:ilvl="8">
       <w:start w:val="1"/>
@@ -3392,6 +3428,7 @@
         </w:tabs>
         <w:ind w:start="3600" w:hanging="360"/>
       </w:pPr>
+      <w:rPr/>
     </w:lvl>
   </w:abstractNum>
   <w:abstractNum w:abstractNumId="7">
@@ -3571,6 +3608,7 @@
         </w:tabs>
         <w:ind w:start="1440" w:hanging="360"/>
       </w:pPr>
+      <w:rPr/>
     </w:lvl>
     <w:lvl w:ilvl="3">
       <w:start w:val="1"/>
@@ -3583,6 +3621,7 @@
         </w:tabs>
         <w:ind w:start="1800" w:hanging="360"/>
       </w:pPr>
+      <w:rPr/>
     </w:lvl>
     <w:lvl w:ilvl="4">
       <w:start w:val="1"/>
@@ -3595,6 +3634,7 @@
         </w:tabs>
         <w:ind w:start="2160" w:hanging="360"/>
       </w:pPr>
+      <w:rPr/>
     </w:lvl>
     <w:lvl w:ilvl="5">
       <w:start w:val="1"/>
@@ -3607,6 +3647,7 @@
         </w:tabs>
         <w:ind w:start="2520" w:hanging="360"/>
       </w:pPr>
+      <w:rPr/>
     </w:lvl>
     <w:lvl w:ilvl="6">
       <w:start w:val="1"/>
@@ -3619,6 +3660,7 @@
         </w:tabs>
         <w:ind w:start="2880" w:hanging="360"/>
       </w:pPr>
+      <w:rPr/>
     </w:lvl>
     <w:lvl w:ilvl="7">
       <w:start w:val="1"/>
@@ -3631,6 +3673,7 @@
         </w:tabs>
         <w:ind w:start="3240" w:hanging="360"/>
       </w:pPr>
+      <w:rPr/>
     </w:lvl>
     <w:lvl w:ilvl="8">
       <w:start w:val="1"/>
@@ -3643,6 +3686,7 @@
         </w:tabs>
         <w:ind w:start="3600" w:hanging="360"/>
       </w:pPr>
+      <w:rPr/>
     </w:lvl>
   </w:abstractNum>
   <w:abstractNum w:abstractNumId="9">
@@ -3808,6 +3852,7 @@
         </w:tabs>
         <w:ind w:start="1440" w:hanging="360"/>
       </w:pPr>
+      <w:rPr/>
     </w:lvl>
     <w:lvl w:ilvl="3">
       <w:start w:val="1"/>
@@ -3820,6 +3865,7 @@
         </w:tabs>
         <w:ind w:start="1800" w:hanging="360"/>
       </w:pPr>
+      <w:rPr/>
     </w:lvl>
     <w:lvl w:ilvl="4">
       <w:start w:val="1"/>
@@ -3832,6 +3878,7 @@
         </w:tabs>
         <w:ind w:start="2160" w:hanging="360"/>
       </w:pPr>
+      <w:rPr/>
     </w:lvl>
     <w:lvl w:ilvl="5">
       <w:start w:val="1"/>
@@ -3844,6 +3891,7 @@
         </w:tabs>
         <w:ind w:start="2520" w:hanging="360"/>
       </w:pPr>
+      <w:rPr/>
     </w:lvl>
     <w:lvl w:ilvl="6">
       <w:start w:val="1"/>
@@ -3856,6 +3904,7 @@
         </w:tabs>
         <w:ind w:start="2880" w:hanging="360"/>
       </w:pPr>
+      <w:rPr/>
     </w:lvl>
     <w:lvl w:ilvl="7">
       <w:start w:val="1"/>
@@ -3868,6 +3917,7 @@
         </w:tabs>
         <w:ind w:start="3240" w:hanging="360"/>
       </w:pPr>
+      <w:rPr/>
     </w:lvl>
     <w:lvl w:ilvl="8">
       <w:start w:val="1"/>
@@ -3880,6 +3930,7 @@
         </w:tabs>
         <w:ind w:start="3600" w:hanging="360"/>
       </w:pPr>
+      <w:rPr/>
     </w:lvl>
   </w:abstractNum>
   <w:abstractNum w:abstractNumId="11">
@@ -3925,7 +3976,6 @@
     <w:lvl w:ilvl="3">
       <w:start w:val="1"/>
       <w:numFmt w:val="none"/>
-      <w:pStyle w:val="Heading4"/>
       <w:suff w:val="nothing"/>
       <w:lvlText w:val=""/>
       <w:lvlJc w:val="start"/>
@@ -4052,7 +4102,6 @@
     </w:rPrDefault>
     <w:pPrDefault>
       <w:pPr>
-        <w:widowControl/>
         <w:suppressAutoHyphens w:val="true"/>
       </w:pPr>
     </w:pPrDefault>
@@ -4062,7 +4111,10 @@
     <w:qFormat/>
     <w:pPr>
       <w:widowControl/>
+      <w:suppressAutoHyphens w:val="true"/>
       <w:bidi w:val="0"/>
+      <w:spacing w:before="0" w:after="0"/>
+      <w:jc w:val="start"/>
     </w:pPr>
     <w:rPr>
       <w:rFonts w:ascii="Liberation Serif" w:hAnsi="Liberation Serif" w:eastAsia="DejaVu Sans" w:cs="FreeSans"/>
@@ -4075,7 +4127,7 @@
   </w:style>
   <w:style w:type="paragraph" w:styleId="Heading4">
     <w:name w:val="heading 4"/>
-    <w:basedOn w:val="Ttulo"/>
+    <w:basedOn w:val="Ttulouser"/>
     <w:next w:val="BodyText"/>
     <w:qFormat/>
     <w:pPr>
@@ -4090,20 +4142,20 @@
       <w:szCs w:val="24"/>
     </w:rPr>
   </w:style>
-  <w:style w:type="character" w:styleId="Marcadores">
-    <w:name w:val="Marcadores"/>
+  <w:style w:type="character" w:styleId="Marcadoresuser">
+    <w:name w:val="Marcadores (user)"/>
     <w:qFormat/>
     <w:rPr>
       <w:rFonts w:ascii="OpenSymbol" w:hAnsi="OpenSymbol" w:eastAsia="OpenSymbol" w:cs="OpenSymbol"/>
     </w:rPr>
   </w:style>
-  <w:style w:type="character" w:styleId="Smbolosdenumerao">
-    <w:name w:val="Símbolos de numeração"/>
+  <w:style w:type="character" w:styleId="Smbolosdenumeraouser">
+    <w:name w:val="Símbolos de numeração (user)"/>
     <w:qFormat/>
     <w:rPr/>
   </w:style>
-  <w:style w:type="character" w:styleId="Cdigo-fonte">
-    <w:name w:val="Código-fonte"/>
+  <w:style w:type="character" w:styleId="Cdigo-fonteuser">
+    <w:name w:val="Código-fonte (user)"/>
     <w:qFormat/>
     <w:rPr>
       <w:rFonts w:ascii="Liberation Mono" w:hAnsi="Liberation Mono" w:eastAsia="Liberation Mono" w:cs="Liberation Mono"/>
@@ -4113,7 +4165,6 @@
     <w:name w:val="Título"/>
     <w:basedOn w:val="Normal"/>
     <w:next w:val="BodyText"/>
-    <w:qFormat/>
     <w:pPr>
       <w:keepNext w:val="true"/>
       <w:spacing w:before="240" w:after="120"/>
@@ -4158,6 +4209,31 @@
   </w:style>
   <w:style w:type="paragraph" w:styleId="ndice">
     <w:name w:val="Índice"/>
+    <w:basedOn w:val="Normal"/>
+    <w:pPr>
+      <w:suppressLineNumbers/>
+    </w:pPr>
+    <w:rPr>
+      <w:rFonts w:cs="FreeSans"/>
+    </w:rPr>
+  </w:style>
+  <w:style w:type="paragraph" w:styleId="Ttulouser">
+    <w:name w:val="Título (user)"/>
+    <w:basedOn w:val="Normal"/>
+    <w:next w:val="BodyText"/>
+    <w:qFormat/>
+    <w:pPr>
+      <w:keepNext w:val="true"/>
+      <w:spacing w:before="240" w:after="120"/>
+    </w:pPr>
+    <w:rPr>
+      <w:rFonts w:ascii="Liberation Sans" w:hAnsi="Liberation Sans" w:eastAsia="DejaVu Sans" w:cs="FreeSans"/>
+      <w:sz w:val="28"/>
+      <w:szCs w:val="28"/>
+    </w:rPr>
+  </w:style>
+  <w:style w:type="paragraph" w:styleId="ndiceuser">
+    <w:name w:val="Índice (user)"/>
     <w:basedOn w:val="Normal"/>
     <w:qFormat/>
     <w:pPr>

</xml_diff>